<commit_message>
Add Existing Algorithm (v1) section and walkthrough script appendix
- Section 3 now includes 'Existing Algorithm (v1) and Identified
  Defects': the real computeMatchScore code (vetScore, slotsNorm,
  windowNorm, urgScore, specScore, proxScore, ltcScore) reproduced
  verbatim from lambda/arbitrator/index.ts, with an honest scoping
  note that this term's success criteria fix specScore and the
  softWeights via AHP but do not recalibrate the /5, /120, /30
  normalization constants or the ltcScore/slotsNorm duplication.
- Appendix B: the recorded-walkthrough talking-point script, embedded
  as planning evidence alongside the AI-use log in Appendix A.

Co-Authored-By: Claude Sonnet 5 <noreply@anthropic.com>
</commit_message>
<xml_diff>
--- a/docs/CISC699_HardStop1_Proposal.docx
+++ b/docs/CISC699_HardStop1_Proposal.docx
@@ -207,7 +207,7 @@
           <w:sz w:val="22"/>
           <w:szCs w:val="22"/>
         </w:rPr>
-        <w:t xml:space="preserve">This section leads the document per this week's task instructions, so AI use is established before any other content is read. Generative AI assistance (Claude, Anthropic) was used throughout the preparation of this proposal, in the same structured, per-instance format adopted in Week 1 (tool, date/phase, purpose, prompt/task summary, output used, affected section/artifact, human verification, final student revisions). The complete, cumulative AI-use log — including this week's entries below — is reproduced in full as Appendix A, addressing the Week 1 feedback that the log file itself, not just a reference to it, should be included as a submission artifact.</w:t>
+        <w:t xml:space="preserve">This section leads the document per this week's task instructions, so AI use is established before any other content is read. Generative AI assistance (Claude, Anthropic) was used throughout the preparation of this proposal, in the same structured, per-instance format adopted in Week 1 (tool, date/phase, purpose, prompt/task summary, output used, affected section/artifact, human verification, final student revisions). The complete, cumulative AI-use log — including this week's entries below — is reproduced in full as Appendix A, addressing the Week 1 feedback that the log file itself, not just a reference to it, should be included as a submission artifact. The talking-point script prepared for this week's required recorded walkthrough is reproduced as Appendix B.</w:t>
       </w:r>
     </w:p>
     <w:p>
@@ -2771,6 +2771,266 @@
           <w:szCs w:val="22"/>
         </w:rPr>
         <w:t xml:space="preserve">•  Aspirational: a real-world shelter pilot deployment of the hardened router, contingent on this term's success criteria (Section 5) being met and on a future, separate conversation about project ownership and data-sharing terms.</w:t>
+      </w:r>
+    </w:p>
+    <w:p>
+      <w:pPr>
+        <w:keepNext/>
+        <w:spacing w:after="100" w:before="200" w:line="264"/>
+      </w:pPr>
+      <w:r>
+        <w:rPr>
+          <w:rFonts w:ascii="Calibri" w:cs="Calibri" w:eastAsia="Calibri" w:hAnsi="Calibri"/>
+          <w:b/>
+          <w:bCs/>
+          <w:color w:val="0A3A35"/>
+          <w:sz w:val="24"/>
+          <w:szCs w:val="24"/>
+        </w:rPr>
+        <w:t xml:space="preserve">Existing Algorithm (v1) and Identified Defects</w:t>
+      </w:r>
+    </w:p>
+    <w:p>
+      <w:pPr>
+        <w:spacing w:after="120" w:before="0" w:line="264"/>
+        <w:jc w:val="both"/>
+      </w:pPr>
+      <w:r>
+        <w:rPr>
+          <w:rFonts w:ascii="Calibri" w:cs="Calibri" w:eastAsia="Calibri" w:hAnsi="Calibri"/>
+          <w:sz w:val="22"/>
+          <w:szCs w:val="22"/>
+        </w:rPr>
+        <w:t xml:space="preserve">The arbitrator's computeMatchScore function (lambda/arbitrator/index.ts) computes five factor scores per shelter bid, combines them using the case's needs-profile softWeights, and scales the result by the bid's stated confidence and a data-freshness multiplier. Reproduced verbatim below, not paraphrased, so the actual constants are visible:</w:t>
+      </w:r>
+    </w:p>
+    <w:p>
+      <w:pPr>
+        <w:pBdr>
+          <w:top w:val="single" w:color="CCCCCC" w:sz="2"/>
+          <w:bottom w:val="single" w:color="CCCCCC" w:sz="2"/>
+          <w:left w:val="single" w:color="CCCCCC" w:sz="2"/>
+          <w:right w:val="single" w:color="CCCCCC" w:sz="2"/>
+        </w:pBdr>
+        <w:shd w:fill="F2F2F2" w:val="clear"/>
+        <w:spacing w:after="160" w:before="80" w:line="230"/>
+      </w:pPr>
+      <w:r>
+        <w:rPr>
+          <w:rFonts w:ascii="Courier New" w:cs="Courier New" w:eastAsia="Courier New" w:hAnsi="Courier New"/>
+          <w:sz w:val="18"/>
+          <w:szCs w:val="18"/>
+        </w:rPr>
+        <w:t xml:space="preserve">const vetScore   = bid.hasVetOnSite ? 1.00 : bid.vetCanBeArranged ? 0.60 : 0.00;</w:t>
+      </w:r>
+      <w:r>
+        <w:rPr>
+          <w:rFonts w:ascii="Courier New" w:cs="Courier New" w:eastAsia="Courier New" w:hAnsi="Courier New"/>
+          <w:sz w:val="18"/>
+          <w:szCs w:val="18"/>
+        </w:rPr>
+        <w:br/>
+        <w:t xml:space="preserve">const slotsNorm  = Math.min((bid.availableSlots ?? 0) / 5, 1.0);</w:t>
+      </w:r>
+      <w:r>
+        <w:rPr>
+          <w:rFonts w:ascii="Courier New" w:cs="Courier New" w:eastAsia="Courier New" w:hAnsi="Courier New"/>
+          <w:sz w:val="18"/>
+          <w:szCs w:val="18"/>
+        </w:rPr>
+        <w:br/>
+        <w:t xml:space="preserve">const windowNorm = Math.max(0, 1 - (bid.estimatedIntakeWindowMinutes ?? 60) / 120);</w:t>
+      </w:r>
+      <w:r>
+        <w:rPr>
+          <w:rFonts w:ascii="Courier New" w:cs="Courier New" w:eastAsia="Courier New" w:hAnsi="Courier New"/>
+          <w:sz w:val="18"/>
+          <w:szCs w:val="18"/>
+        </w:rPr>
+        <w:br/>
+        <w:t xml:space="preserve">const urgScore   = (slotsNorm + windowNorm) / 2;</w:t>
+      </w:r>
+      <w:r>
+        <w:rPr>
+          <w:rFonts w:ascii="Courier New" w:cs="Courier New" w:eastAsia="Courier New" w:hAnsi="Courier New"/>
+          <w:sz w:val="18"/>
+          <w:szCs w:val="18"/>
+        </w:rPr>
+        <w:br/>
+        <w:t xml:space="preserve">const specScore  = bid.acceptedSpecies ? 0.85 : 0.50;</w:t>
+      </w:r>
+      <w:r>
+        <w:rPr>
+          <w:rFonts w:ascii="Courier New" w:cs="Courier New" w:eastAsia="Courier New" w:hAnsi="Courier New"/>
+          <w:sz w:val="18"/>
+          <w:szCs w:val="18"/>
+        </w:rPr>
+        <w:br/>
+        <w:t xml:space="preserve"/>
+      </w:r>
+      <w:r>
+        <w:rPr>
+          <w:rFonts w:ascii="Courier New" w:cs="Courier New" w:eastAsia="Courier New" w:hAnsi="Courier New"/>
+          <w:sz w:val="18"/>
+          <w:szCs w:val="18"/>
+        </w:rPr>
+        <w:br/>
+        <w:t xml:space="preserve">const proxScore = Math.max(0, 1 - dist / 30);</w:t>
+      </w:r>
+      <w:r>
+        <w:rPr>
+          <w:rFonts w:ascii="Courier New" w:cs="Courier New" w:eastAsia="Courier New" w:hAnsi="Courier New"/>
+          <w:sz w:val="18"/>
+          <w:szCs w:val="18"/>
+        </w:rPr>
+        <w:br/>
+        <w:t xml:space="preserve">const ltcScore  = slotsNorm;</w:t>
+      </w:r>
+      <w:r>
+        <w:rPr>
+          <w:rFonts w:ascii="Courier New" w:cs="Courier New" w:eastAsia="Courier New" w:hAnsi="Courier New"/>
+          <w:sz w:val="18"/>
+          <w:szCs w:val="18"/>
+        </w:rPr>
+        <w:br/>
+        <w:t xml:space="preserve"/>
+      </w:r>
+      <w:r>
+        <w:rPr>
+          <w:rFonts w:ascii="Courier New" w:cs="Courier New" w:eastAsia="Courier New" w:hAnsi="Courier New"/>
+          <w:sz w:val="18"/>
+          <w:szCs w:val="18"/>
+        </w:rPr>
+        <w:br/>
+        <w:t xml:space="preserve">const raw = vetScore  * weights.vet_care +</w:t>
+      </w:r>
+      <w:r>
+        <w:rPr>
+          <w:rFonts w:ascii="Courier New" w:cs="Courier New" w:eastAsia="Courier New" w:hAnsi="Courier New"/>
+          <w:sz w:val="18"/>
+          <w:szCs w:val="18"/>
+        </w:rPr>
+        <w:br/>
+        <w:t xml:space="preserve">            urgScore  * weights.pickup_urgency +</w:t>
+      </w:r>
+      <w:r>
+        <w:rPr>
+          <w:rFonts w:ascii="Courier New" w:cs="Courier New" w:eastAsia="Courier New" w:hAnsi="Courier New"/>
+          <w:sz w:val="18"/>
+          <w:szCs w:val="18"/>
+        </w:rPr>
+        <w:br/>
+        <w:t xml:space="preserve">            specScore * weights.species_specialization +</w:t>
+      </w:r>
+      <w:r>
+        <w:rPr>
+          <w:rFonts w:ascii="Courier New" w:cs="Courier New" w:eastAsia="Courier New" w:hAnsi="Courier New"/>
+          <w:sz w:val="18"/>
+          <w:szCs w:val="18"/>
+        </w:rPr>
+        <w:br/>
+        <w:t xml:space="preserve">            proxScore * weights.proximity +</w:t>
+      </w:r>
+      <w:r>
+        <w:rPr>
+          <w:rFonts w:ascii="Courier New" w:cs="Courier New" w:eastAsia="Courier New" w:hAnsi="Courier New"/>
+          <w:sz w:val="18"/>
+          <w:szCs w:val="18"/>
+        </w:rPr>
+        <w:br/>
+        <w:t xml:space="preserve">            ltcScore  * weights.long_term_care;</w:t>
+      </w:r>
+      <w:r>
+        <w:rPr>
+          <w:rFonts w:ascii="Courier New" w:cs="Courier New" w:eastAsia="Courier New" w:hAnsi="Courier New"/>
+          <w:sz w:val="18"/>
+          <w:szCs w:val="18"/>
+        </w:rPr>
+        <w:br/>
+        <w:t xml:space="preserve"/>
+      </w:r>
+      <w:r>
+        <w:rPr>
+          <w:rFonts w:ascii="Courier New" w:cs="Courier New" w:eastAsia="Courier New" w:hAnsi="Courier New"/>
+          <w:sz w:val="18"/>
+          <w:szCs w:val="18"/>
+        </w:rPr>
+        <w:br/>
+        <w:t xml:space="preserve">return raw * bid.confidence * FRESHNESS_WEIGHT[bid.dataFreshness];</w:t>
+      </w:r>
+    </w:p>
+    <w:p>
+      <w:pPr>
+        <w:spacing w:after="80" w:before="0" w:line="264"/>
+        <w:ind w:left="450" w:hanging="270"/>
+        <w:jc w:val="both"/>
+      </w:pPr>
+      <w:r>
+        <w:rPr>
+          <w:rFonts w:ascii="Calibri" w:cs="Calibri" w:eastAsia="Calibri" w:hAnsi="Calibri"/>
+          <w:sz w:val="22"/>
+          <w:szCs w:val="22"/>
+        </w:rPr>
+        <w:t xml:space="preserve">•  Confirmed defect, targeted by SC1: specScore checks whether bid.acceptedSpecies exists as an array, not whether it contains the case's actual species. Since almost every bid populates some array, this term is close to a constant 0.85 regardless of whether the shelter actually handles that species.</w:t>
+      </w:r>
+    </w:p>
+    <w:p>
+      <w:pPr>
+        <w:spacing w:after="80" w:before="0" w:line="264"/>
+        <w:ind w:left="450" w:hanging="270"/>
+        <w:jc w:val="both"/>
+      </w:pPr>
+      <w:r>
+        <w:rPr>
+          <w:rFonts w:ascii="Calibri" w:cs="Calibri" w:eastAsia="Calibri" w:hAnsi="Calibri"/>
+          <w:sz w:val="22"/>
+          <w:szCs w:val="22"/>
+        </w:rPr>
+        <w:t xml:space="preserve">•  Hand-picked normalization constants, not targeted by any success criterion this term: the /5 slots denominator, the /120-minute window denominator, and the /30 km distance denominator were set without calibration against outcome data. No evidence establishes why 5 available slots, a 120-minute window, or 30 km represent "fully normalized" for this domain.</w:t>
+      </w:r>
+    </w:p>
+    <w:p>
+      <w:pPr>
+        <w:spacing w:after="80" w:before="0" w:line="264"/>
+        <w:ind w:left="450" w:hanging="270"/>
+        <w:jc w:val="both"/>
+      </w:pPr>
+      <w:r>
+        <w:rPr>
+          <w:rFonts w:ascii="Calibri" w:cs="Calibri" w:eastAsia="Calibri" w:hAnsi="Calibri"/>
+          <w:sz w:val="22"/>
+          <w:szCs w:val="22"/>
+        </w:rPr>
+        <w:t xml:space="preserve">•  ltcScore duplicates slotsNorm exactly: the long_term_care factor is not independently computed — it reuses the identical value already used inside urgScore for pickup_urgency. Two of the five softWeights dimensions are therefore partly driven by the same underlying number despite being weighted as distinct factors.</w:t>
+      </w:r>
+    </w:p>
+    <w:p>
+      <w:pPr>
+        <w:spacing w:after="80" w:before="0" w:line="264"/>
+        <w:ind w:left="450" w:hanging="270"/>
+        <w:jc w:val="both"/>
+      </w:pPr>
+      <w:r>
+        <w:rPr>
+          <w:rFonts w:ascii="Calibri" w:cs="Calibri" w:eastAsia="Calibri" w:hAnsi="Calibri"/>
+          <w:sz w:val="22"/>
+          <w:szCs w:val="22"/>
+        </w:rPr>
+        <w:t xml:space="preserve">•  FRESHNESS_WEIGHT (LIVE 1.00 / HUMAN 0.88 / SYNCED 0.75 / STATIC 0.55) is a fourth set of hand-picked constants applied after the weighted sum — the same pattern as the normalization denominators above, not previously flagged in the Week 1 audit.</w:t>
+      </w:r>
+    </w:p>
+    <w:p>
+      <w:pPr>
+        <w:spacing w:after="120" w:before="0" w:line="264"/>
+        <w:jc w:val="both"/>
+      </w:pPr>
+      <w:r>
+        <w:rPr>
+          <w:rFonts w:ascii="Calibri" w:cs="Calibri" w:eastAsia="Calibri" w:hAnsi="Calibri"/>
+          <w:sz w:val="22"/>
+          <w:szCs w:val="22"/>
+        </w:rPr>
+        <w:t xml:space="preserve">Scoping note: this term's success criteria (Section 5) fix the confirmed specScore defect (SC1) and replace the five softWeights themselves via AHP (SC2) — they do not extend to recalibrating the /5, /120, or /30 normalization constants, the FRESHNESS_WEIGHT table, or resolving the ltcScore/slotsNorm duplication. These are disclosed here as known limitations that remain after this term's hardening work, consistent with the scope boundaries in Section 9.</w:t>
       </w:r>
     </w:p>
     <w:p>
@@ -11902,6 +12162,492 @@
           <w:szCs w:val="22"/>
         </w:rPr>
         <w:t xml:space="preserve">AI-assisted development spanned the earlier coursework this project descends from: code and infrastructure implementation (CDK stacks, Lambda functions, GraphQL schema, mobile app), the GRAD 695 Applied Project Report and its figures, and the ISEM 502 UX Portfolio (personas, heuristic evaluation, prototypes), all drafted from student direction and reviewed by the student. No AI-generated or fabricated user-research data was presented as real at any point; where a course step assumed data unavailable to the student, the constraint was disclosed rather than simulated.</w:t>
+      </w:r>
+    </w:p>
+    <w:p>
+      <w:r>
+        <w:br w:type="page"/>
+      </w:r>
+    </w:p>
+    <w:p>
+      <w:pPr>
+        <w:keepNext/>
+        <w:pBdr>
+          <w:bottom w:val="single" w:color="0F4C46" w:sz="8" w:space="4"/>
+        </w:pBdr>
+        <w:spacing w:after="140" w:before="320" w:line="264"/>
+      </w:pPr>
+      <w:r>
+        <w:rPr>
+          <w:rFonts w:ascii="Calibri" w:cs="Calibri" w:eastAsia="Calibri" w:hAnsi="Calibri"/>
+          <w:b/>
+          <w:bCs/>
+          <w:color w:val="0F4C46"/>
+          <w:sz w:val="30"/>
+          <w:szCs w:val="30"/>
+        </w:rPr>
+        <w:t xml:space="preserve">Appendix B: Recorded Walkthrough Script</w:t>
+      </w:r>
+    </w:p>
+    <w:p>
+      <w:pPr>
+        <w:spacing w:after="120" w:before="0" w:line="264"/>
+        <w:jc w:val="both"/>
+      </w:pPr>
+      <w:r>
+        <w:rPr>
+          <w:rFonts w:ascii="Calibri" w:cs="Calibri" w:eastAsia="Calibri" w:hAnsi="Calibri"/>
+          <w:sz w:val="22"/>
+          <w:szCs w:val="22"/>
+        </w:rPr>
+        <w:t xml:space="preserve">Talking-point script prepared for the 8–12 minute recorded walkthrough (RU-02 Criterion 6, 50 points). Delivered from memory in the student's own words, not read verbatim; reproduced here as planning evidence of what the recording covers and why, section by section. Total target run time ≈ 10–11 minutes across the 11 beats below.</w:t>
+      </w:r>
+    </w:p>
+    <w:p>
+      <w:pPr>
+        <w:keepNext/>
+        <w:spacing w:after="60" w:before="120" w:line="264"/>
+      </w:pPr>
+      <w:r>
+        <w:rPr>
+          <w:rFonts w:ascii="Calibri" w:cs="Calibri" w:eastAsia="Calibri" w:hAnsi="Calibri"/>
+          <w:b/>
+          <w:bCs/>
+          <w:i/>
+          <w:iCs/>
+          <w:sz w:val="22"/>
+          <w:szCs w:val="22"/>
+        </w:rPr>
+        <w:t xml:space="preserve">1. Orient (30–45 sec)</w:t>
+      </w:r>
+    </w:p>
+    <w:p>
+      <w:pPr>
+        <w:spacing w:after="160" w:before="0" w:line="264"/>
+        <w:ind w:left="360"/>
+        <w:jc w:val="both"/>
+      </w:pPr>
+      <w:r>
+        <w:rPr>
+          <w:rFonts w:ascii="Calibri" w:cs="Calibri" w:eastAsia="Calibri" w:hAnsi="Calibri"/>
+          <w:i/>
+          <w:iCs/>
+          <w:sz w:val="22"/>
+          <w:szCs w:val="22"/>
+        </w:rPr>
+        <w:t xml:space="preserve">"This is RescueNet — a multi-agent AWS system I built across ISEM 502 and GRAD 695 that routes stray/injured animal reports to shelters. For CISC 699, my supervisor approved a specific, narrower mandate: harden the case-routing algorithm — not rebuild the whole system."</w:t>
+      </w:r>
+    </w:p>
+    <w:p>
+      <w:pPr>
+        <w:keepNext/>
+        <w:spacing w:after="60" w:before="120" w:line="264"/>
+      </w:pPr>
+      <w:r>
+        <w:rPr>
+          <w:rFonts w:ascii="Calibri" w:cs="Calibri" w:eastAsia="Calibri" w:hAnsi="Calibri"/>
+          <w:b/>
+          <w:bCs/>
+          <w:i/>
+          <w:iCs/>
+          <w:sz w:val="22"/>
+          <w:szCs w:val="22"/>
+        </w:rPr>
+        <w:t xml:space="preserve">2. The problem, and what's confirmed vs. aspirational (60–90 sec)</w:t>
+      </w:r>
+    </w:p>
+    <w:p>
+      <w:pPr>
+        <w:spacing w:after="160" w:before="0" w:line="264"/>
+        <w:ind w:left="360"/>
+        <w:jc w:val="both"/>
+      </w:pPr>
+      <w:r>
+        <w:rPr>
+          <w:rFonts w:ascii="Calibri" w:cs="Calibri" w:eastAsia="Calibri" w:hAnsi="Calibri"/>
+          <w:i/>
+          <w:iCs/>
+          <w:sz w:val="22"/>
+          <w:szCs w:val="22"/>
+        </w:rPr>
+        <w:t xml:space="preserve">"I audited the arbitrator's scoring code directly and found two real issues: normalization constants that were hand-picked with no calibration, and a species-match term that's effectively broken — it checks whether an array exists, not whether the species actually matches. I verified this by reading the source and by running one real case end-to-end through the live system. One thing I tightened up this week based on feedback: I now explicitly separate confirmed evidence — the code defect, the live test — from plausible context, like the New York shelters I've identified as candidate pilot partners but haven't signed anything with. I don't want to overstate where this project actually stands."</w:t>
+      </w:r>
+    </w:p>
+    <w:p>
+      <w:pPr>
+        <w:keepNext/>
+        <w:spacing w:after="60" w:before="120" w:line="264"/>
+      </w:pPr>
+      <w:r>
+        <w:rPr>
+          <w:rFonts w:ascii="Calibri" w:cs="Calibri" w:eastAsia="Calibri" w:hAnsi="Calibri"/>
+          <w:b/>
+          <w:bCs/>
+          <w:i/>
+          <w:iCs/>
+          <w:sz w:val="22"/>
+          <w:szCs w:val="22"/>
+        </w:rPr>
+        <w:t xml:space="preserve">3. Objectives → success criteria traceability (60 sec)</w:t>
+      </w:r>
+    </w:p>
+    <w:p>
+      <w:pPr>
+        <w:spacing w:after="160" w:before="0" w:line="264"/>
+        <w:ind w:left="360"/>
+        <w:jc w:val="both"/>
+      </w:pPr>
+      <w:r>
+        <w:rPr>
+          <w:rFonts w:ascii="Calibri" w:cs="Calibri" w:eastAsia="Calibri" w:hAnsi="Calibri"/>
+          <w:i/>
+          <w:iCs/>
+          <w:sz w:val="22"/>
+          <w:szCs w:val="22"/>
+        </w:rPr>
+        <w:t xml:space="preserve">"Every objective maps to exactly one measurable success criterion — that was a self-check this assignment asked for. Fix the defect → regression test passes. Replace hand-picked weights with AHP → consistency ratio under 0.10. Build a comparison harness → side-by-side report on real and synthetic cases. Deploy without regression → latency and error rate stay flat. Documentation → supervisor sign-off at the Week 7 midpoint."</w:t>
+      </w:r>
+    </w:p>
+    <w:p>
+      <w:pPr>
+        <w:keepNext/>
+        <w:spacing w:after="60" w:before="120" w:line="264"/>
+      </w:pPr>
+      <w:r>
+        <w:rPr>
+          <w:rFonts w:ascii="Calibri" w:cs="Calibri" w:eastAsia="Calibri" w:hAnsi="Calibri"/>
+          <w:b/>
+          <w:bCs/>
+          <w:i/>
+          <w:iCs/>
+          <w:sz w:val="22"/>
+          <w:szCs w:val="22"/>
+        </w:rPr>
+        <w:t xml:space="preserve">4. AHP protocol — the fully specified version (60–75 sec)</w:t>
+      </w:r>
+    </w:p>
+    <w:p>
+      <w:pPr>
+        <w:spacing w:after="160" w:before="0" w:line="264"/>
+        <w:ind w:left="360"/>
+        <w:jc w:val="both"/>
+      </w:pPr>
+      <w:r>
+        <w:rPr>
+          <w:rFonts w:ascii="Calibri" w:cs="Calibri" w:eastAsia="Calibri" w:hAnsi="Calibri"/>
+          <w:i/>
+          <w:iCs/>
+          <w:sz w:val="22"/>
+          <w:szCs w:val="22"/>
+        </w:rPr>
+        <w:t xml:space="preserve">"This is the part reviewer feedback pushed me hardest on last week — I'd only said "we'll use AHP" without saying how. Now it's fully operational: I'm the primary judge, scoring five factors — vet care, pickup urgency, species specialization, proximity, long-term care — in a 5×5 pairwise matrix on Saaty's 1–9 scale. I derive weights from the matrix, compute a consistency ratio, and if it's 0.10 or above, I redo the judgments before accepting them. That happens in Week 6, after the factors are locked in Week 3 and the harness is built in Week 4."</w:t>
+      </w:r>
+    </w:p>
+    <w:p>
+      <w:pPr>
+        <w:keepNext/>
+        <w:spacing w:after="60" w:before="120" w:line="264"/>
+      </w:pPr>
+      <w:r>
+        <w:rPr>
+          <w:rFonts w:ascii="Calibri" w:cs="Calibri" w:eastAsia="Calibri" w:hAnsi="Calibri"/>
+          <w:b/>
+          <w:bCs/>
+          <w:i/>
+          <w:iCs/>
+          <w:sz w:val="22"/>
+          <w:szCs w:val="22"/>
+        </w:rPr>
+        <w:t xml:space="preserve">5. Architecture and scope boundary (60 sec — show the diagram)</w:t>
+      </w:r>
+    </w:p>
+    <w:p>
+      <w:pPr>
+        <w:spacing w:after="160" w:before="0" w:line="264"/>
+        <w:ind w:left="360"/>
+        <w:jc w:val="both"/>
+      </w:pPr>
+      <w:r>
+        <w:rPr>
+          <w:rFonts w:ascii="Calibri" w:cs="Calibri" w:eastAsia="Calibri" w:hAnsi="Calibri"/>
+          <w:i/>
+          <w:iCs/>
+          <w:sz w:val="22"/>
+          <w:szCs w:val="22"/>
+        </w:rPr>
+        <w:t xml:space="preserve">"Here's the full blackboard architecture — reporters and shelters on the outside, the shared case record and event bus in the middle, specialist agents around it. My entire scope this term is one box: the Arbitrator's scoring logic. Everything else — Rekognition, Bedrock, the mobile app, the event bus — is a stable foundation I'm not touching."</w:t>
+      </w:r>
+    </w:p>
+    <w:p>
+      <w:pPr>
+        <w:keepNext/>
+        <w:spacing w:after="60" w:before="120" w:line="264"/>
+      </w:pPr>
+      <w:r>
+        <w:rPr>
+          <w:rFonts w:ascii="Calibri" w:cs="Calibri" w:eastAsia="Calibri" w:hAnsi="Calibri"/>
+          <w:b/>
+          <w:bCs/>
+          <w:i/>
+          <w:iCs/>
+          <w:sz w:val="22"/>
+          <w:szCs w:val="22"/>
+        </w:rPr>
+        <w:t xml:space="preserve">6. MACP feasibility, briefly (45–60 sec)</w:t>
+      </w:r>
+    </w:p>
+    <w:p>
+      <w:pPr>
+        <w:spacing w:after="160" w:before="0" w:line="264"/>
+        <w:ind w:left="360"/>
+        <w:jc w:val="both"/>
+      </w:pPr>
+      <w:r>
+        <w:rPr>
+          <w:rFonts w:ascii="Calibri" w:cs="Calibri" w:eastAsia="Calibri" w:hAnsi="Calibri"/>
+          <w:i/>
+          <w:iCs/>
+          <w:sz w:val="22"/>
+          <w:szCs w:val="22"/>
+        </w:rPr>
+        <w:t xml:space="preserve">"On Machine: Node 20, CDK, and — this is new this week — an actual GitHub remote with an issue tracker, which was the one gap called out in my last review. On Computational: this is deliberately rule-based plus AHP, not machine learning, because I don't have the real case volume yet to train anything credible — that's an honest constraint, not a shortcut. On API: eight live AWS/Slack integrations, all already working, no new vendor agreements needed."</w:t>
+      </w:r>
+    </w:p>
+    <w:p>
+      <w:pPr>
+        <w:keepNext/>
+        <w:spacing w:after="60" w:before="120" w:line="264"/>
+      </w:pPr>
+      <w:r>
+        <w:rPr>
+          <w:rFonts w:ascii="Calibri" w:cs="Calibri" w:eastAsia="Calibri" w:hAnsi="Calibri"/>
+          <w:b/>
+          <w:bCs/>
+          <w:i/>
+          <w:iCs/>
+          <w:sz w:val="22"/>
+          <w:szCs w:val="22"/>
+        </w:rPr>
+        <w:t xml:space="preserve">7. Project plan and phases (45–60 sec)</w:t>
+      </w:r>
+    </w:p>
+    <w:p>
+      <w:pPr>
+        <w:spacing w:after="160" w:before="0" w:line="264"/>
+        <w:ind w:left="360"/>
+        <w:jc w:val="both"/>
+      </w:pPr>
+      <w:r>
+        <w:rPr>
+          <w:rFonts w:ascii="Calibri" w:cs="Calibri" w:eastAsia="Calibri" w:hAnsi="Calibri"/>
+          <w:i/>
+          <w:iCs/>
+          <w:sz w:val="22"/>
+          <w:szCs w:val="22"/>
+        </w:rPr>
+        <w:t xml:space="preserve">"Four phases mapped to the syllabus's 14-week schedule: design and planning through Week 4, implementation through Week 8 — including the AHP session and the midpoint demo — evaluation and reporting through Week 11, then finalization. This submission itself is Hard Stop 1, the Week 2 proposal-approval checkpoint."</w:t>
+      </w:r>
+    </w:p>
+    <w:p>
+      <w:pPr>
+        <w:keepNext/>
+        <w:spacing w:after="60" w:before="120" w:line="264"/>
+      </w:pPr>
+      <w:r>
+        <w:rPr>
+          <w:rFonts w:ascii="Calibri" w:cs="Calibri" w:eastAsia="Calibri" w:hAnsi="Calibri"/>
+          <w:b/>
+          <w:bCs/>
+          <w:i/>
+          <w:iCs/>
+          <w:sz w:val="22"/>
+          <w:szCs w:val="22"/>
+        </w:rPr>
+        <w:t xml:space="preserve">8. Out of scope, on purpose (30 sec)</w:t>
+      </w:r>
+    </w:p>
+    <w:p>
+      <w:pPr>
+        <w:spacing w:after="160" w:before="0" w:line="264"/>
+        <w:ind w:left="360"/>
+        <w:jc w:val="both"/>
+      </w:pPr>
+      <w:r>
+        <w:rPr>
+          <w:rFonts w:ascii="Calibri" w:cs="Calibri" w:eastAsia="Calibri" w:hAnsi="Calibri"/>
+          <w:i/>
+          <w:iCs/>
+          <w:sz w:val="22"/>
+          <w:szCs w:val="22"/>
+        </w:rPr>
+        <w:t xml:space="preserve">"Explicitly not this term: the rest of the shelter-onboarding portal, any real shelter data-sharing agreement, the geocoding fallback defect — that's a real bug but outside my mandate, so it's tracked as a GitHub issue instead of scope creep — and machine-learned weighting, which is a stretch goal at best."</w:t>
+      </w:r>
+    </w:p>
+    <w:p>
+      <w:pPr>
+        <w:keepNext/>
+        <w:spacing w:after="60" w:before="120" w:line="264"/>
+      </w:pPr>
+      <w:r>
+        <w:rPr>
+          <w:rFonts w:ascii="Calibri" w:cs="Calibri" w:eastAsia="Calibri" w:hAnsi="Calibri"/>
+          <w:b/>
+          <w:bCs/>
+          <w:i/>
+          <w:iCs/>
+          <w:sz w:val="22"/>
+          <w:szCs w:val="22"/>
+        </w:rPr>
+        <w:t xml:space="preserve">9. Risks and ethics (45 sec)</w:t>
+      </w:r>
+    </w:p>
+    <w:p>
+      <w:pPr>
+        <w:spacing w:after="160" w:before="0" w:line="264"/>
+        <w:ind w:left="360"/>
+        <w:jc w:val="both"/>
+      </w:pPr>
+      <w:r>
+        <w:rPr>
+          <w:rFonts w:ascii="Calibri" w:cs="Calibri" w:eastAsia="Calibri" w:hAnsi="Calibri"/>
+          <w:i/>
+          <w:iCs/>
+          <w:sz w:val="22"/>
+          <w:szCs w:val="22"/>
+        </w:rPr>
+        <w:t xml:space="preserve">"Biggest risk is real case volume — I likely won't have enough to fully validate calibration, so I'm treating synthetic scenarios as primary evidence and outcome-based calibration as a stretch goal. On ethics: no PII, reports are anonymous by design, so there's no IRB concern for this specific scope."</w:t>
+      </w:r>
+    </w:p>
+    <w:p>
+      <w:pPr>
+        <w:keepNext/>
+        <w:spacing w:after="60" w:before="120" w:line="264"/>
+      </w:pPr>
+      <w:r>
+        <w:rPr>
+          <w:rFonts w:ascii="Calibri" w:cs="Calibri" w:eastAsia="Calibri" w:hAnsi="Calibri"/>
+          <w:b/>
+          <w:bCs/>
+          <w:i/>
+          <w:iCs/>
+          <w:sz w:val="22"/>
+          <w:szCs w:val="22"/>
+        </w:rPr>
+        <w:t xml:space="preserve">10. What's still conditional (30–45 sec)</w:t>
+      </w:r>
+    </w:p>
+    <w:p>
+      <w:pPr>
+        <w:spacing w:after="160" w:before="0" w:line="264"/>
+        <w:ind w:left="360"/>
+        <w:jc w:val="both"/>
+      </w:pPr>
+      <w:r>
+        <w:rPr>
+          <w:rFonts w:ascii="Calibri" w:cs="Calibri" w:eastAsia="Calibri" w:hAnsi="Calibri"/>
+          <w:i/>
+          <w:iCs/>
+          <w:sz w:val="22"/>
+          <w:szCs w:val="22"/>
+        </w:rPr>
+        <w:t xml:space="preserve">"Three things I'm still waiting on from my supervisor: confirmation of the remaining hard-stop dates, whether they want to participate as a second AHP judge or just review my result, and whether the seeded shelter data is an acceptable evidence base for the midpoint given no real shelter partnership yet."</w:t>
+      </w:r>
+    </w:p>
+    <w:p>
+      <w:pPr>
+        <w:keepNext/>
+        <w:spacing w:after="60" w:before="120" w:line="264"/>
+      </w:pPr>
+      <w:r>
+        <w:rPr>
+          <w:rFonts w:ascii="Calibri" w:cs="Calibri" w:eastAsia="Calibri" w:hAnsi="Calibri"/>
+          <w:b/>
+          <w:bCs/>
+          <w:i/>
+          <w:iCs/>
+          <w:sz w:val="22"/>
+          <w:szCs w:val="22"/>
+        </w:rPr>
+        <w:t xml:space="preserve">11. Close — next evidence, own the decisions (30 sec)</w:t>
+      </w:r>
+    </w:p>
+    <w:p>
+      <w:pPr>
+        <w:spacing w:after="160" w:before="0" w:line="264"/>
+        <w:ind w:left="360"/>
+        <w:jc w:val="both"/>
+      </w:pPr>
+      <w:r>
+        <w:rPr>
+          <w:rFonts w:ascii="Calibri" w:cs="Calibri" w:eastAsia="Calibri" w:hAnsi="Calibri"/>
+          <w:i/>
+          <w:iCs/>
+          <w:sz w:val="22"/>
+          <w:szCs w:val="22"/>
+        </w:rPr>
+        <w:t xml:space="preserve">"By Week 4 I'll have the five scoring factors formalized and the evaluation harness designed. The scope calls, the success-criteria thresholds, and resolving the GitHub gap this week instead of deferring it again — those were my calls, not just AI-assisted drafting. Ready for feedback."</w:t>
+      </w:r>
+    </w:p>
+    <w:p>
+      <w:pPr>
+        <w:keepNext/>
+        <w:spacing w:after="100" w:before="200" w:line="264"/>
+      </w:pPr>
+      <w:r>
+        <w:rPr>
+          <w:rFonts w:ascii="Calibri" w:cs="Calibri" w:eastAsia="Calibri" w:hAnsi="Calibri"/>
+          <w:b/>
+          <w:bCs/>
+          <w:color w:val="0A3A35"/>
+          <w:sz w:val="24"/>
+          <w:szCs w:val="24"/>
+        </w:rPr>
+        <w:t xml:space="preserve">Recording Plan</w:t>
+      </w:r>
+    </w:p>
+    <w:p>
+      <w:pPr>
+        <w:spacing w:after="80" w:before="0" w:line="264"/>
+        <w:ind w:left="450" w:hanging="270"/>
+        <w:jc w:val="both"/>
+      </w:pPr>
+      <w:r>
+        <w:rPr>
+          <w:rFonts w:ascii="Calibri" w:cs="Calibri" w:eastAsia="Calibri" w:hAnsi="Calibri"/>
+          <w:sz w:val="22"/>
+          <w:szCs w:val="22"/>
+        </w:rPr>
+        <w:t xml:space="preserve">•  To be recorded via Zoom local "Record to this Computer," using pause/resume between beats rather than one continuous take, to keep each section clean.</w:t>
+      </w:r>
+    </w:p>
+    <w:p>
+      <w:pPr>
+        <w:spacing w:after="80" w:before="0" w:line="264"/>
+        <w:ind w:left="450" w:hanging="270"/>
+        <w:jc w:val="both"/>
+      </w:pPr>
+      <w:r>
+        <w:rPr>
+          <w:rFonts w:ascii="Calibri" w:cs="Calibri" w:eastAsia="Calibri" w:hAnsi="Calibri"/>
+          <w:sz w:val="22"/>
+          <w:szCs w:val="22"/>
+        </w:rPr>
+        <w:t xml:space="preserve">•  Delivered from memory using this script's talking points, not read verbatim on camera.</w:t>
+      </w:r>
+    </w:p>
+    <w:p>
+      <w:pPr>
+        <w:spacing w:after="80" w:before="0" w:line="264"/>
+        <w:ind w:left="450" w:hanging="270"/>
+        <w:jc w:val="both"/>
+      </w:pPr>
+      <w:r>
+        <w:rPr>
+          <w:rFonts w:ascii="Calibri" w:cs="Calibri" w:eastAsia="Calibri" w:hAnsi="Calibri"/>
+          <w:sz w:val="22"/>
+          <w:szCs w:val="22"/>
+        </w:rPr>
+        <w:t xml:space="preserve">•  Submitted to Canvas as the media-recording component alongside this document as the file-upload component.</w:t>
       </w:r>
     </w:p>
     <w:sectPr>

</xml_diff>